<commit_message>
Align resume with medical XR positioning
</commit_message>
<xml_diff>
--- a/Sanket_Das_Resume_ATS.docx
+++ b/Sanket_Das_Resume_ATS.docx
@@ -21,12 +21,7 @@
         <w:spacing w:after="40"/>
       </w:pPr>
       <w:r>
-        <w:rPr>
-          <w:color w:val="444444"/>
-          <w:sz w:val="21"/>
-          <w:szCs w:val="21"/>
-        </w:rPr>
-        <w:t>XR / VR Developer | Technical Lead | Medical | Defence | Corporate Training</w:t>
+        <w:t>VR &amp; AI Developer | Technical Lead | Medical &amp; Enterprise XR | European Healthcare</w:t>
       </w:r>
     </w:p>
     <w:p>
@@ -105,13 +100,7 @@
         <w:spacing w:after="60"/>
       </w:pPr>
       <w:r>
-        <w:t xml:space="preserve">XR/VR Developer and Technical Lead with </w:t>
-      </w:r>
-      <w:r>
-        <w:t>5</w:t>
-      </w:r>
-      <w:r>
-        <w:t xml:space="preserve">+ years of experience designing and shipping immersive simulations for medical, pharmaceutical, and corporate training sectors. Proven expertise delivering multiplatform XR applications in Unity and Unreal Engine for European clients. Specialises in AI-integrated real-time 3D experiences, GPT-driven NPC systems, procedural scenario logic, and reusable modular XR frameworks. </w:t>
+        <w:t>VR &amp; AI Developer and Technical Lead with 5+ years shipping production applications for the European healthcare and enterprise XR market. Specialises in Unity, Unreal Engine, AI-integrated XR, medical storytelling, GPT-driven NPC systems, procedural scenario logic, and reusable modular XR frameworks for pharma, medtech, and enterprise clients.</w:t>
       </w:r>
     </w:p>
     <w:p>
@@ -136,16 +125,10 @@
       <w:pPr>
         <w:spacing w:after="60"/>
       </w:pPr>
-      <w:r>
-        <w:t xml:space="preserve">XR / VR / AR Development, Medical XR Simulation, Unity (C#) and Unreal Engine 5, AI NPC Integration (GPT), Meta Quest 2/3 Deployment, Modular SDK Architecture, </w:t>
-      </w:r>
       <w:proofErr w:type="spellStart"/>
-      <w:r>
-        <w:t>ElevenLabs</w:t>
-      </w:r>
       <w:proofErr w:type="spellEnd"/>
       <w:r>
-        <w:t xml:space="preserve"> Voice AI, Multiplatform iOS / Android / PC, Procedural Scenario Logic, Cinematic Animation, Real-Time 3D Simulation</w:t>
+        <w:t>XR / VR Development, Medical XR Simulation, Enterprise XR, Unity (C#) and Unreal Engine 5, AI NPC Integration (GPT / Convai), Meta Quest 2/3 Deployment, Modular UPM Architecture, ElevenLabs Voice AI, Ready Player Me Avatars, Multiplatform iOS / Android / PC, Procedural Scenario Logic, Cinematic Animation, Real-Time 3D Simulation</w:t>
       </w:r>
     </w:p>
     <w:p>
@@ -218,79 +201,31 @@
         </w:numPr>
       </w:pPr>
       <w:r>
-        <w:t>Lead</w:t>
-      </w:r>
-      <w:r>
-        <w:t>ing a</w:t>
-      </w:r>
-      <w:r>
-        <w:t xml:space="preserve"> cross-functional development team on a multiplatform XR</w:t>
-      </w:r>
-      <w:r>
-        <w:t>/Mobile component</w:t>
-      </w:r>
-      <w:r>
-        <w:t xml:space="preserve"> </w:t>
-      </w:r>
-      <w:r>
-        <w:t>warehousing solution</w:t>
-      </w:r>
-      <w:r>
-        <w:t xml:space="preserve"> in Unity targeting Meta Quest, iOS, and Android simultaneously.</w:t>
-      </w:r>
-    </w:p>
-    <w:p>
-      <w:pPr>
-        <w:pStyle w:val="ListParagraph"/>
-        <w:numPr>
-          <w:ilvl w:val="0"/>
-          <w:numId w:val="2"/>
-        </w:numPr>
-      </w:pPr>
-      <w:r>
-        <w:t>Architect</w:t>
-      </w:r>
-      <w:r>
-        <w:t>ing</w:t>
-      </w:r>
-      <w:r>
-        <w:t xml:space="preserve"> a modular Unity Package Manager (UPM) system of reusable multi-platform components to accelerate delivery across client projects.</w:t>
-      </w:r>
-    </w:p>
-    <w:p>
-      <w:pPr>
-        <w:pStyle w:val="ListParagraph"/>
-        <w:numPr>
-          <w:ilvl w:val="0"/>
-          <w:numId w:val="2"/>
-        </w:numPr>
-      </w:pPr>
-      <w:r>
-        <w:t xml:space="preserve">Built a </w:t>
-      </w:r>
-      <w:r>
-        <w:t xml:space="preserve">GDD </w:t>
-      </w:r>
-      <w:r>
-        <w:t>-</w:t>
-      </w:r>
-      <w:r>
-        <w:t xml:space="preserve"> </w:t>
-      </w:r>
-      <w:r>
-        <w:t>to</w:t>
-      </w:r>
-      <w:r>
-        <w:t xml:space="preserve"> - LLM – flow - controller graph</w:t>
-      </w:r>
-      <w:r>
-        <w:t xml:space="preserve"> pipeline that reads a Game Design Document, converts it to a </w:t>
-      </w:r>
-      <w:r>
-        <w:t>flow graph</w:t>
-      </w:r>
-      <w:r>
-        <w:t xml:space="preserve"> and auto-wires a pre-built mechanics library, reducing time from concept to playable build from weeks to hours.</w:t>
+        <w:t>Built a GDD-to-LLM-flow-controller graph pipeline that reads a Game Design Document, converts it to a flow graph and auto-wires a pre-built mechanics library, reducing time from concept to playable build from weeks to hours.</w:t>
+      </w:r>
+    </w:p>
+    <w:p>
+      <w:pPr>
+        <w:pStyle w:val="ListParagraph"/>
+        <w:numPr>
+          <w:ilvl w:val="0"/>
+          <w:numId w:val="2"/>
+        </w:numPr>
+      </w:pPr>
+      <w:r>
+        <w:t>Leading a cross-functional development team on a multiplatform XR/Mobile component warehousing solution in Unity targeting Meta Quest, iOS, and Android simultaneously.</w:t>
+      </w:r>
+    </w:p>
+    <w:p>
+      <w:pPr>
+        <w:pStyle w:val="ListParagraph"/>
+        <w:numPr>
+          <w:ilvl w:val="0"/>
+          <w:numId w:val="2"/>
+        </w:numPr>
+      </w:pPr>
+      <w:r>
+        <w:t>Architecting a modular Unity Package Manager (UPM) system of reusable multi-platform components to accelerate delivery across client projects.</w:t>
       </w:r>
     </w:p>
     <w:p>
@@ -345,7 +280,7 @@
         </w:numPr>
       </w:pPr>
       <w:r>
-        <w:t>Led all programming on VR Medical Storytelling single-player applications, delivering patient education and HCP training tools for major pharmaceutical clients.</w:t>
+        <w:t>Led all programming on VR Medical Storytelling single-player applications, delivering patient education and HCP training tools for major pharmaceutical clients in Europe.</w:t>
       </w:r>
     </w:p>
     <w:p>
@@ -368,16 +303,10 @@
           <w:numId w:val="2"/>
         </w:numPr>
       </w:pPr>
-      <w:r>
-        <w:t xml:space="preserve">Integrated </w:t>
-      </w:r>
       <w:proofErr w:type="spellStart"/>
-      <w:r>
-        <w:t>ElevenLabs</w:t>
-      </w:r>
       <w:proofErr w:type="spellEnd"/>
       <w:r>
-        <w:t xml:space="preserve"> API for generative NPC voice acting inside VR, eliminating dependency on pre-recorded studio audio.</w:t>
+        <w:t>Integrated ElevenLabs API for generative NPC voice acting inside VR medical narratives, reducing dependency on pre-recorded studio audio.</w:t>
       </w:r>
     </w:p>
     <w:p>
@@ -409,7 +338,7 @@
         </w:numPr>
       </w:pPr>
       <w:r>
-        <w:t>Developed a GPT-powered 3D AI character with context-driven motion capture animation selection for adaptive real-time interactions.</w:t>
+        <w:t>Developed a GPT-powered 3D AI character with context-driven motion capture animation selection for believable adaptive real-time interactions.</w:t>
       </w:r>
     </w:p>
     <w:p>
@@ -464,7 +393,7 @@
         </w:numPr>
       </w:pPr>
       <w:r>
-        <w:t>Designed and built a first aid VR training application for the German market, featuring driving simulations, emergency call interactions, AI pedestrians, accident animations, and hands-on object manipulation.</w:t>
+        <w:t>Designed and built a standalone first aid VR training simulator for the German certification market, featuring driving simulations, emergency calls, AI pedestrians, accident animations, and hands-on object manipulation.</w:t>
       </w:r>
     </w:p>
     <w:p>
@@ -773,23 +702,10 @@
       <w:pPr>
         <w:spacing w:before="40" w:after="40"/>
       </w:pPr>
-      <w:r>
-        <w:rPr>
-          <w:b/>
-          <w:bCs/>
-        </w:rPr>
-        <w:t xml:space="preserve">AI and APIs: </w:t>
-      </w:r>
-      <w:r>
-        <w:t xml:space="preserve">OpenAI GPT API, </w:t>
-      </w:r>
       <w:proofErr w:type="spellStart"/>
-      <w:r>
-        <w:t>ElevenLabs</w:t>
-      </w:r>
       <w:proofErr w:type="spellEnd"/>
       <w:r>
-        <w:t xml:space="preserve"> API, Ready Player Me SDK</w:t>
+        <w:t>AI and APIs: OpenAI GPT API, Convai SDK, ElevenLabs API, Ready Player Me SDK</w:t>
       </w:r>
     </w:p>
     <w:p>
@@ -832,14 +748,7 @@
         <w:spacing w:before="40" w:after="40"/>
       </w:pPr>
       <w:r>
-        <w:rPr>
-          <w:b/>
-          <w:bCs/>
-        </w:rPr>
-        <w:t xml:space="preserve">Domain Skills: </w:t>
-      </w:r>
-      <w:r>
-        <w:t>XR Simulation Design, Medical Storytelling, Training Scenario Logic, Modular SDK Architecture, Level Design, Economy Balancing</w:t>
+        <w:t>Domain Skills: Medical Storytelling, Enterprise XR, XR Simulation Design, Patient Education, Training Scenario Logic, Modular SDK Architecture, Level Design, Economy Balancing</w:t>
       </w:r>
     </w:p>
     <w:p>

</xml_diff>